<commit_message>
fix(services): resolve XML namespace corruption in Berita Acara Word template
</commit_message>
<xml_diff>
--- a/assets/templates/Berita_Acara-Template.docx
+++ b/assets/templates/Berita_Acara-Template.docx
@@ -1,17 +1,17 @@
 
 <file path=word/document.xml><?xml version="1.0" encoding="utf-8"?>
-<w:document xmlns:ns1="http://schemas.openxmlformats.org/markup-compatibility/2006" xmlns:ns2="http://schemas.microsoft.com/office/word/2010/wordml" xmlns:ns3="http://schemas.openxmlformats.org/officeDocument/2006/relationships" xmlns:w="http://schemas.openxmlformats.org/wordprocessingml/2006/main" ns1:Ignorable="w14 w15 w16se w16cid w16 w16cex w16sdtdh w16sdtfl w16du wp14">
+<w:document xmlns:wpc="http://schemas.microsoft.com/office/word/2010/wordprocessingCanvas" xmlns:cx="http://schemas.microsoft.com/office/drawing/2014/chartex" xmlns:cx1="http://schemas.microsoft.com/office/drawing/2015/9/8/chartex" xmlns:cx2="http://schemas.microsoft.com/office/drawing/2015/10/21/chartex" xmlns:cx3="http://schemas.microsoft.com/office/drawing/2016/5/9/chartex" xmlns:cx4="http://schemas.microsoft.com/office/drawing/2016/5/10/chartex" xmlns:cx5="http://schemas.microsoft.com/office/drawing/2016/5/11/chartex" xmlns:cx6="http://schemas.microsoft.com/office/drawing/2016/5/12/chartex" xmlns:cx7="http://schemas.microsoft.com/office/drawing/2016/5/13/chartex" xmlns:cx8="http://schemas.microsoft.com/office/drawing/2016/5/14/chartex" xmlns:mc="http://schemas.openxmlformats.org/markup-compatibility/2006" xmlns:aink="http://schemas.microsoft.com/office/drawing/2016/ink" xmlns:am3d="http://schemas.microsoft.com/office/drawing/2017/model3d" xmlns:o="urn:schemas-microsoft-com:office:office" xmlns:oel="http://schemas.microsoft.com/office/2019/extlst" xmlns:r="http://schemas.openxmlformats.org/officeDocument/2006/relationships" xmlns:m="http://schemas.openxmlformats.org/officeDocument/2006/math" xmlns:v="urn:schemas-microsoft-com:vml" xmlns:wp14="http://schemas.microsoft.com/office/word/2010/wordprocessingDrawing" xmlns:wp="http://schemas.openxmlformats.org/drawingml/2006/wordprocessingDrawing" xmlns:w10="urn:schemas-microsoft-com:office:word" xmlns:w="http://schemas.openxmlformats.org/wordprocessingml/2006/main" xmlns:w14="http://schemas.microsoft.com/office/word/2010/wordml" xmlns:w15="http://schemas.microsoft.com/office/word/2012/wordml" xmlns:w16cex="http://schemas.microsoft.com/office/word/2018/wordml/cex" xmlns:w16cid="http://schemas.microsoft.com/office/word/2016/wordml/cid" xmlns:w16="http://schemas.microsoft.com/office/word/2018/wordml" xmlns:w16du="http://schemas.microsoft.com/office/word/2023/wordml/word16du" xmlns:w16sdtdh="http://schemas.microsoft.com/office/word/2020/wordml/sdtdatahash" xmlns:w16sdtfl="http://schemas.microsoft.com/office/word/2024/wordml/sdtformatlock" xmlns:w16se="http://schemas.microsoft.com/office/word/2015/wordml/symex" xmlns:wpg="http://schemas.microsoft.com/office/word/2010/wordprocessingGroup" xmlns:wpi="http://schemas.microsoft.com/office/word/2010/wordprocessingInk" xmlns:wne="http://schemas.microsoft.com/office/word/2006/wordml" xmlns:wps="http://schemas.microsoft.com/office/word/2010/wordprocessingShape" mc:Ignorable="w14 w15 w16se w16cid w16 w16cex w16sdtdh w16sdtfl w16du wp14">
   <w:body>
-    <w:p ns2:paraId="1E803BD3" ns2:textId="77777777">
-      <w:pPr>
-        <w:rPr>
-          <w:rFonts w:ascii="Arial" w:hAnsi="Arial" w:cs="Arial"/>
-          <w:b/>
-          <w:sz w:val="18"/>
-        </w:rPr>
-      </w:pPr>
-    </w:p>
-    <w:p ns2:paraId="3883D762" ns2:textId="77777777">
+    <w:p>
+      <w:pPr>
+        <w:rPr>
+          <w:rFonts w:ascii="Arial" w:hAnsi="Arial" w:cs="Arial"/>
+          <w:b/>
+          <w:sz w:val="18"/>
+        </w:rPr>
+      </w:pPr>
+    </w:p>
+    <w:p>
       <w:pPr>
         <w:jc w:val="center"/>
         <w:rPr>
@@ -32,53 +32,28 @@
         <w:t>BERITA ACARA</w:t>
       </w:r>
     </w:p>
-    <w:p ns2:paraId="34EA9A40" ns2:textId="77777777">
-      <w:pPr>
-        <w:rPr>
-          <w:rFonts w:ascii="Arial" w:hAnsi="Arial" w:cs="Arial"/>
-          <w:sz w:val="18"/>
-        </w:rPr>
-      </w:pPr>
-    </w:p>
-    <w:p ns2:paraId="272C6650" ns2:textId="266FE10F">
-      <w:pPr>
-        <w:rPr>
-          <w:rFonts w:ascii="Arial" w:hAnsi="Arial" w:cs="Arial"/>
-          <w:sz w:val="18"/>
-        </w:rPr>
-      </w:pPr>
-      <w:r>
-        <w:rPr>
-          <w:rFonts w:ascii="Arial" w:hAnsi="Arial" w:cs="Arial"/>
-          <w:sz w:val="18"/>
-        </w:rPr>
-        <w:t xml:space="preserve">Yang </w:t>
-      </w:r>
-      <w:proofErr w:type="spellStart"/>
-      <w:r>
-        <w:rPr>
-          <w:rFonts w:ascii="Arial" w:hAnsi="Arial" w:cs="Arial"/>
-          <w:sz w:val="18"/>
-        </w:rPr>
-        <w:t>bertandatangan</w:t>
-      </w:r>
-      <w:proofErr w:type="spellEnd"/>
-      <w:r>
-        <w:rPr>
-          <w:rFonts w:ascii="Arial" w:hAnsi="Arial" w:cs="Arial"/>
-          <w:sz w:val="18"/>
-        </w:rPr>
-        <w:t xml:space="preserve"> di </w:t>
-      </w:r>
-      <w:proofErr w:type="spellStart"/>
-      <w:r>
-        <w:rPr>
-          <w:rFonts w:ascii="Arial" w:hAnsi="Arial" w:cs="Arial"/>
-          <w:sz w:val="18"/>
-        </w:rPr>
-        <w:t>bawah</w:t>
-      </w:r>
-      <w:proofErr w:type="spellEnd"/>
+    <w:p>
+      <w:pPr>
+        <w:rPr>
+          <w:rFonts w:ascii="Arial" w:hAnsi="Arial" w:cs="Arial"/>
+          <w:sz w:val="18"/>
+        </w:rPr>
+      </w:pPr>
+    </w:p>
+    <w:p>
+      <w:pPr>
+        <w:rPr>
+          <w:rFonts w:ascii="Arial" w:hAnsi="Arial" w:cs="Arial"/>
+          <w:sz w:val="18"/>
+        </w:rPr>
+      </w:pPr>
+      <w:r>
+        <w:rPr>
+          <w:rFonts w:ascii="Arial" w:hAnsi="Arial" w:cs="Arial"/>
+          <w:sz w:val="18"/>
+        </w:rPr>
+        <w:t>Yang bertandatangan di bawah</w:t>
+      </w:r>
       <w:r>
         <w:rPr>
           <w:rFonts w:ascii="Arial" w:hAnsi="Arial" w:cs="Arial"/>
@@ -86,7 +61,6 @@
         </w:rPr>
         <w:t xml:space="preserve"> </w:t>
       </w:r>
-      <w:proofErr w:type="spellStart"/>
       <w:r>
         <w:rPr>
           <w:rFonts w:ascii="Arial" w:hAnsi="Arial" w:cs="Arial"/>
@@ -94,7 +68,6 @@
         </w:rPr>
         <w:t>ini</w:t>
       </w:r>
-      <w:proofErr w:type="spellEnd"/>
       <w:r>
         <w:rPr>
           <w:rFonts w:ascii="Arial" w:hAnsi="Arial" w:cs="Arial"/>
@@ -102,7 +75,6 @@
         </w:rPr>
         <w:t xml:space="preserve"> </w:t>
       </w:r>
-      <w:proofErr w:type="spellStart"/>
       <w:r>
         <w:rPr>
           <w:rFonts w:ascii="Arial" w:hAnsi="Arial" w:cs="Arial"/>
@@ -110,7 +82,6 @@
         </w:rPr>
         <w:t>menerangkan</w:t>
       </w:r>
-      <w:proofErr w:type="spellEnd"/>
       <w:r>
         <w:rPr>
           <w:rFonts w:ascii="Arial" w:hAnsi="Arial" w:cs="Arial"/>
@@ -118,43 +89,85 @@
         </w:rPr>
         <w:t xml:space="preserve"> </w:t>
       </w:r>
-      <w:proofErr w:type="spellStart"/>
-      <w:r>
-        <w:rPr>
-          <w:rFonts w:ascii="Arial" w:hAnsi="Arial" w:cs="Arial"/>
-          <w:sz w:val="18"/>
-        </w:rPr>
-        <w:t>bahwa</w:t>
-      </w:r>
-      <w:proofErr w:type="spellEnd"/>
-      <w:r>
-        <w:rPr>
-          <w:rFonts w:ascii="Arial" w:hAnsi="Arial" w:cs="Arial"/>
-          <w:sz w:val="18"/>
-        </w:rPr>
+      <w:r>
+        <w:rPr>
+          <w:rFonts w:ascii="Arial" w:hAnsi="Arial" w:cs="Arial"/>
+          <w:sz w:val="18"/>
+        </w:rPr>
+        <w:t>bahwa:</w:t>
+      </w:r>
+    </w:p>
+    <w:p>
+      <w:pPr>
+        <w:rPr>
+          <w:rFonts w:ascii="Arial" w:hAnsi="Arial" w:cs="Arial"/>
+          <w:sz w:val="18"/>
+        </w:rPr>
+      </w:pPr>
+      <w:r>
+        <w:rPr>
+          <w:rFonts w:ascii="Arial" w:hAnsi="Arial" w:cs="Arial"/>
+          <w:sz w:val="18"/>
+        </w:rPr>
+        <w:t>Nama</w:t>
+      </w:r>
+      <w:r>
+        <w:rPr>
+          <w:rFonts w:ascii="Arial" w:hAnsi="Arial" w:cs="Arial"/>
+          <w:sz w:val="18"/>
+        </w:rPr>
+        <w:tab/>
+      </w:r>
+      <w:r>
+        <w:rPr>
+          <w:rFonts w:ascii="Arial" w:hAnsi="Arial" w:cs="Arial"/>
+          <w:sz w:val="18"/>
+        </w:rPr>
+        <w:tab/>
+      </w:r>
+      <w:r>
+        <w:rPr>
+          <w:rFonts w:ascii="Arial" w:hAnsi="Arial" w:cs="Arial"/>
+          <w:sz w:val="18"/>
+        </w:rPr>
+        <w:tab/>
         <w:t>:</w:t>
       </w:r>
-    </w:p>
-    <w:p ns2:paraId="6D5DD577" ns2:textId="06ECD715">
-      <w:pPr>
-        <w:rPr>
-          <w:rFonts w:ascii="Arial" w:hAnsi="Arial" w:cs="Arial"/>
-          <w:sz w:val="18"/>
-        </w:rPr>
-      </w:pPr>
-      <w:r>
-        <w:rPr>
-          <w:rFonts w:ascii="Arial" w:hAnsi="Arial" w:cs="Arial"/>
-          <w:sz w:val="18"/>
-        </w:rPr>
-        <w:t>Nama</w:t>
-      </w:r>
-      <w:r>
-        <w:rPr>
-          <w:rFonts w:ascii="Arial" w:hAnsi="Arial" w:cs="Arial"/>
-          <w:sz w:val="18"/>
-        </w:rPr>
-        <w:tab/>
+      <w:r>
+        <w:rPr>
+          <w:rFonts w:ascii="Arial" w:hAnsi="Arial" w:cs="Arial"/>
+          <w:sz w:val="18"/>
+        </w:rPr>
+        <w:t xml:space="preserve"> </w:t>
+      </w:r>
+      <w:r>
+        <w:rPr>
+          <w:rFonts w:ascii="Arial" w:hAnsi="Arial" w:cs="Arial"/>
+          <w:sz w:val="18"/>
+        </w:rPr>
+        <w:t>{{NAME}}</w:t>
+      </w:r>
+    </w:p>
+    <w:p>
+      <w:pPr>
+        <w:rPr>
+          <w:rFonts w:ascii="Arial" w:hAnsi="Arial" w:cs="Arial"/>
+          <w:sz w:val="18"/>
+        </w:rPr>
+      </w:pPr>
+      <w:r>
+        <w:rPr>
+          <w:rFonts w:ascii="Arial" w:hAnsi="Arial" w:cs="Arial"/>
+          <w:sz w:val="18"/>
+        </w:rPr>
+        <w:t>NPP</w:t>
+      </w:r>
+      <w:r>
+        <w:rPr>
+          <w:rFonts w:ascii="Arial" w:hAnsi="Arial" w:cs="Arial"/>
+          <w:sz w:val="18"/>
+        </w:rPr>
+        <w:t xml:space="preserve"> BNI</w:t>
       </w:r>
       <w:r>
         <w:rPr>
@@ -183,29 +196,22 @@
           <w:rFonts w:ascii="Arial" w:hAnsi="Arial" w:cs="Arial"/>
           <w:sz w:val="18"/>
         </w:rPr>
-        <w:t>{{NAME}}</w:t>
-      </w:r>
-    </w:p>
-    <w:p ns2:paraId="019D019B" ns2:textId="4703F9A6">
-      <w:pPr>
-        <w:rPr>
-          <w:rFonts w:ascii="Arial" w:hAnsi="Arial" w:cs="Arial"/>
-          <w:sz w:val="18"/>
-        </w:rPr>
-      </w:pPr>
-      <w:r>
-        <w:rPr>
-          <w:rFonts w:ascii="Arial" w:hAnsi="Arial" w:cs="Arial"/>
-          <w:sz w:val="18"/>
-        </w:rPr>
-        <w:t>NPP</w:t>
-      </w:r>
-      <w:r>
-        <w:rPr>
-          <w:rFonts w:ascii="Arial" w:hAnsi="Arial" w:cs="Arial"/>
-          <w:sz w:val="18"/>
-        </w:rPr>
-        <w:t xml:space="preserve"> BNI</w:t>
+        <w:t>{{NPP}}</w:t>
+      </w:r>
+    </w:p>
+    <w:p>
+      <w:pPr>
+        <w:rPr>
+          <w:rFonts w:ascii="Arial" w:hAnsi="Arial" w:cs="Arial"/>
+          <w:sz w:val="18"/>
+        </w:rPr>
+      </w:pPr>
+      <w:r>
+        <w:rPr>
+          <w:rFonts w:ascii="Arial" w:hAnsi="Arial" w:cs="Arial"/>
+          <w:sz w:val="18"/>
+        </w:rPr>
+        <w:t>Departement</w:t>
       </w:r>
       <w:r>
         <w:rPr>
@@ -234,63 +240,16 @@
           <w:rFonts w:ascii="Arial" w:hAnsi="Arial" w:cs="Arial"/>
           <w:sz w:val="18"/>
         </w:rPr>
-        <w:t>{{NPP}}</w:t>
-      </w:r>
-    </w:p>
-    <w:p ns2:paraId="43D31E3B" ns2:textId="7E8D37E8">
-      <w:pPr>
-        <w:rPr>
-          <w:rFonts w:ascii="Arial" w:hAnsi="Arial" w:cs="Arial"/>
-          <w:sz w:val="18"/>
-        </w:rPr>
-      </w:pPr>
-      <w:proofErr w:type="spellStart"/>
-      <w:r>
-        <w:rPr>
-          <w:rFonts w:ascii="Arial" w:hAnsi="Arial" w:cs="Arial"/>
-          <w:sz w:val="18"/>
-        </w:rPr>
-        <w:t>Departement</w:t>
-      </w:r>
-      <w:proofErr w:type="spellEnd"/>
-      <w:r>
-        <w:rPr>
-          <w:rFonts w:ascii="Arial" w:hAnsi="Arial" w:cs="Arial"/>
-          <w:sz w:val="18"/>
-        </w:rPr>
-        <w:tab/>
-      </w:r>
-      <w:r>
-        <w:rPr>
-          <w:rFonts w:ascii="Arial" w:hAnsi="Arial" w:cs="Arial"/>
-          <w:sz w:val="18"/>
-        </w:rPr>
-        <w:tab/>
-        <w:t>:</w:t>
-      </w:r>
-      <w:r>
-        <w:rPr>
-          <w:rFonts w:ascii="Arial" w:hAnsi="Arial" w:cs="Arial"/>
-          <w:sz w:val="18"/>
-        </w:rPr>
-        <w:t xml:space="preserve"> </w:t>
-      </w:r>
-      <w:r>
-        <w:rPr>
-          <w:rFonts w:ascii="Arial" w:hAnsi="Arial" w:cs="Arial"/>
-          <w:sz w:val="18"/>
-        </w:rPr>
         <w:t>{{DEPARTMENT}}</w:t>
       </w:r>
     </w:p>
-    <w:p ns2:paraId="153B9BC5" ns2:textId="0AA6C0FC">
-      <w:pPr>
-        <w:rPr>
-          <w:rFonts w:ascii="Arial" w:hAnsi="Arial" w:cs="Arial"/>
-          <w:sz w:val="18"/>
-        </w:rPr>
-      </w:pPr>
-      <w:proofErr w:type="spellStart"/>
+    <w:p>
+      <w:pPr>
+        <w:rPr>
+          <w:rFonts w:ascii="Arial" w:hAnsi="Arial" w:cs="Arial"/>
+          <w:sz w:val="18"/>
+        </w:rPr>
+      </w:pPr>
       <w:r>
         <w:rPr>
           <w:rFonts w:ascii="Arial" w:hAnsi="Arial" w:cs="Arial"/>
@@ -298,7 +257,6 @@
         </w:rPr>
         <w:t>Kelompok</w:t>
       </w:r>
-      <w:proofErr w:type="spellEnd"/>
       <w:r>
         <w:rPr>
           <w:rFonts w:ascii="Arial" w:hAnsi="Arial" w:cs="Arial"/>
@@ -330,13 +288,13 @@
         <w:tblLook w:val="04A0" w:firstRow="1" w:lastRow="0" w:firstColumn="1" w:lastColumn="0" w:noHBand="0" w:noVBand="1"/>
       </w:tblPr>
       <w:tblGrid>
-        <w:gridCol w:w="2268"/>
-        <w:gridCol w:w="993"/>
-        <w:gridCol w:w="1417"/>
-        <w:gridCol w:w="1418"/>
-        <w:gridCol w:w="4110"/>
+        <w:gridCol w:w="2134"/>
+        <w:gridCol w:w="978"/>
+        <w:gridCol w:w="1667"/>
+        <w:gridCol w:w="1657"/>
+        <w:gridCol w:w="3770"/>
       </w:tblGrid>
-      <w:tr ns2:paraId="61C8B759" ns2:textId="77777777">
+      <w:tr>
         <w:trPr>
           <w:trHeight w:val="331"/>
         </w:trPr>
@@ -346,7 +304,7 @@
             <w:shd w:val="clear" w:color="auto" w:fill="D9D9D9" w:themeFill="background1" w:themeFillShade="D9"/>
             <w:vAlign w:val="center"/>
           </w:tcPr>
-          <w:p ns2:paraId="2AD3A258" ns2:textId="77777777">
+          <w:p>
             <w:pPr>
               <w:jc w:val="center"/>
               <w:rPr>
@@ -371,7 +329,7 @@
             <w:shd w:val="clear" w:color="auto" w:fill="D9D9D9" w:themeFill="background1" w:themeFillShade="D9"/>
             <w:vAlign w:val="center"/>
           </w:tcPr>
-          <w:p ns2:paraId="1407D247" ns2:textId="77777777">
+          <w:p>
             <w:pPr>
               <w:jc w:val="center"/>
               <w:rPr>
@@ -396,7 +354,7 @@
             <w:shd w:val="clear" w:color="auto" w:fill="D9D9D9" w:themeFill="background1" w:themeFillShade="D9"/>
             <w:vAlign w:val="center"/>
           </w:tcPr>
-          <w:p ns2:paraId="0B1AAC23" ns2:textId="77777777">
+          <w:p>
             <w:pPr>
               <w:jc w:val="center"/>
               <w:rPr>
@@ -421,7 +379,7 @@
             <w:shd w:val="clear" w:color="auto" w:fill="D9D9D9" w:themeFill="background1" w:themeFillShade="D9"/>
             <w:vAlign w:val="center"/>
           </w:tcPr>
-          <w:p ns2:paraId="194A72FD" ns2:textId="77777777">
+          <w:p>
             <w:pPr>
               <w:jc w:val="center"/>
               <w:rPr>
@@ -446,7 +404,7 @@
             <w:shd w:val="clear" w:color="auto" w:fill="D9D9D9" w:themeFill="background1" w:themeFillShade="D9"/>
             <w:vAlign w:val="center"/>
           </w:tcPr>
-          <w:p ns2:paraId="582A1732" ns2:textId="77777777">
+          <w:p>
             <w:pPr>
               <w:jc w:val="center"/>
               <w:rPr>
@@ -466,7 +424,7 @@
           </w:p>
         </w:tc>
       </w:tr>
-      <w:tr ns2:paraId="7B622C80" ns2:textId="77777777">
+      <w:tr>
         <w:trPr>
           <w:trHeight w:val="644"/>
         </w:trPr>
@@ -475,7 +433,7 @@
             <w:tcW w:w="2268" w:type="dxa"/>
             <w:vAlign w:val="center"/>
           </w:tcPr>
-          <w:p ns2:paraId="6C2EB788" ns2:textId="17933F37">
+          <w:p>
             <w:pPr>
               <w:jc w:val="center"/>
               <w:rPr>
@@ -497,7 +455,7 @@
             <w:tcW w:w="993" w:type="dxa"/>
             <w:vAlign w:val="center"/>
           </w:tcPr>
-          <w:p ns2:paraId="5743D351" ns2:textId="5F388D58">
+          <w:p>
             <w:pPr>
               <w:jc w:val="center"/>
               <w:rPr>
@@ -519,7 +477,7 @@
             <w:tcW w:w="1417" w:type="dxa"/>
             <w:vAlign w:val="center"/>
           </w:tcPr>
-          <w:p ns2:paraId="600EAE74" ns2:textId="70289066">
+          <w:p>
             <w:pPr>
               <w:jc w:val="center"/>
               <w:rPr>
@@ -544,7 +502,7 @@
             <w:tcW w:w="1418" w:type="dxa"/>
             <w:vAlign w:val="center"/>
           </w:tcPr>
-          <w:p ns2:paraId="2E4784CA" ns2:textId="267EF924">
+          <w:p>
             <w:pPr>
               <w:jc w:val="center"/>
               <w:rPr>
@@ -569,7 +527,7 @@
             <w:tcW w:w="4110" w:type="dxa"/>
             <w:vAlign w:val="center"/>
           </w:tcPr>
-          <w:p ns2:paraId="08BDFB66" ns2:textId="501DE8F6">
+          <w:p>
             <w:pPr>
               <w:spacing w:line="276" w:lineRule="auto"/>
               <w:jc w:val="center"/>
@@ -589,8 +547,8 @@
         </w:tc>
       </w:tr>
     </w:tbl>
-    <w:p ns2:paraId="00DDC076" ns2:textId="2CF3277A"/>
-    <w:p ns2:paraId="00523067" ns2:textId="4E6AB8EB">
+    <w:p/>
+    <w:p>
       <w:pPr>
         <w:spacing w:line="240" w:lineRule="auto"/>
         <w:contextualSpacing/>
@@ -601,7 +559,7 @@
         </w:rPr>
       </w:pPr>
     </w:p>
-    <w:p ns2:paraId="6F44FF9C" ns2:textId="77777777">
+    <w:p>
       <w:pPr>
         <w:spacing w:line="240" w:lineRule="auto"/>
         <w:contextualSpacing/>
@@ -614,8 +572,8 @@
         </w:rPr>
       </w:pPr>
     </w:p>
-    <w:p ns2:paraId="6D7879BF" ns2:textId="16156092"/>
-    <w:p ns2:paraId="0C2E8499" ns2:textId="197DCA16">
+    <w:p/>
+    <w:p>
       <w:pPr>
         <w:spacing w:line="240" w:lineRule="auto"/>
         <w:contextualSpacing/>
@@ -628,7 +586,7 @@
         </w:rPr>
       </w:pPr>
     </w:p>
-    <w:p ns2:paraId="6C17834E" ns2:textId="3A464735">
+    <w:p>
       <w:pPr>
         <w:spacing w:line="240" w:lineRule="auto"/>
         <w:contextualSpacing/>
@@ -639,7 +597,7 @@
         </w:rPr>
       </w:pPr>
     </w:p>
-    <w:p ns2:paraId="5D1547C3" ns2:textId="68BC7586">
+    <w:p>
       <w:pPr>
         <w:spacing w:line="240" w:lineRule="auto"/>
         <w:contextualSpacing/>
@@ -650,7 +608,7 @@
         </w:rPr>
       </w:pPr>
     </w:p>
-    <w:p ns2:paraId="146EF8CE" ns2:textId="7BE504EB">
+    <w:p>
       <w:pPr>
         <w:tabs>
           <w:tab w:val="left" w:pos="6521"/>
@@ -721,7 +679,7 @@
         <w:t>Saya,</w:t>
       </w:r>
     </w:p>
-    <w:p ns2:paraId="004BBF12" ns2:textId="352696EB">
+    <w:p>
       <w:pPr>
         <w:spacing w:line="240" w:lineRule="auto"/>
         <w:contextualSpacing/>
@@ -733,7 +691,7 @@
         </w:rPr>
       </w:pPr>
     </w:p>
-    <w:p ns2:paraId="74EDCCE8" ns2:textId="5C7B0509">
+    <w:p>
       <w:pPr>
         <w:spacing w:line="240" w:lineRule="auto"/>
         <w:contextualSpacing/>
@@ -744,7 +702,7 @@
         </w:rPr>
       </w:pPr>
     </w:p>
-    <w:p ns2:paraId="61DAE966" ns2:textId="0BB93B04">
+    <w:p>
       <w:pPr>
         <w:spacing w:line="240" w:lineRule="auto"/>
         <w:contextualSpacing/>
@@ -755,7 +713,7 @@
         </w:rPr>
       </w:pPr>
     </w:p>
-    <w:p ns2:paraId="2638E5B8" ns2:textId="77777777">
+    <w:p>
       <w:pPr>
         <w:spacing w:line="240" w:lineRule="auto"/>
         <w:contextualSpacing/>
@@ -766,7 +724,7 @@
         </w:rPr>
       </w:pPr>
     </w:p>
-    <w:p ns2:paraId="6FD17A64" ns2:textId="77777777">
+    <w:p>
       <w:pPr>
         <w:spacing w:line="240" w:lineRule="auto"/>
         <w:contextualSpacing/>
@@ -777,7 +735,7 @@
         </w:rPr>
       </w:pPr>
     </w:p>
-    <w:p ns2:paraId="52513128" ns2:textId="77777777">
+    <w:p>
       <w:pPr>
         <w:spacing w:line="240" w:lineRule="auto"/>
         <w:contextualSpacing/>
@@ -788,7 +746,7 @@
         </w:rPr>
       </w:pPr>
     </w:p>
-    <w:p ns2:paraId="0FD7BBDA" ns2:textId="01D9E0E4">
+    <w:p>
       <w:pPr>
         <w:spacing w:line="240" w:lineRule="auto"/>
         <w:ind w:firstLine="720"/>
@@ -895,28 +853,18 @@
           <w:b/>
           <w:sz w:val="18"/>
         </w:rPr>
-        <w:t xml:space="preserve">{{EMPLOYEE_NAME}}</w:t>
-      </w:r>
-      <w:proofErr w:type="spellStart"/>
-      <w:r>
-        <w:rPr>
-          <w:rFonts w:ascii="Arial" w:hAnsi="Arial" w:cs="Arial"/>
-          <w:b/>
-          <w:sz w:val="18"/>
-        </w:rPr>
-        <w:t/>
-      </w:r>
-      <w:proofErr w:type="spellEnd"/>
-      <w:r>
-        <w:rPr>
-          <w:rFonts w:ascii="Arial" w:hAnsi="Arial" w:cs="Arial"/>
-          <w:b/>
-          <w:sz w:val="18"/>
-        </w:rPr>
-        <w:tab/>
-      </w:r>
-    </w:p>
-    <w:p ns2:paraId="624E5862" ns2:textId="77777777">
+        <w:t>{{EMPLOYEE_NAME}}</w:t>
+      </w:r>
+      <w:r>
+        <w:rPr>
+          <w:rFonts w:ascii="Arial" w:hAnsi="Arial" w:cs="Arial"/>
+          <w:b/>
+          <w:sz w:val="18"/>
+        </w:rPr>
+        <w:tab/>
+      </w:r>
+    </w:p>
+    <w:p>
       <w:pPr>
         <w:spacing w:line="240" w:lineRule="auto"/>
         <w:contextualSpacing/>
@@ -927,7 +875,7 @@
         </w:rPr>
       </w:pPr>
     </w:p>
-    <w:p ns2:paraId="72A19EA9" ns2:textId="77777777">
+    <w:p>
       <w:pPr>
         <w:spacing w:line="240" w:lineRule="auto"/>
         <w:contextualSpacing/>
@@ -939,7 +887,7 @@
         </w:rPr>
       </w:pPr>
     </w:p>
-    <w:p ns2:paraId="3D50AB49" ns2:textId="77777777">
+    <w:p>
       <w:pPr>
         <w:spacing w:line="240" w:lineRule="auto"/>
         <w:contextualSpacing/>
@@ -1004,7 +952,7 @@
         <w:t>Menyetujui</w:t>
       </w:r>
     </w:p>
-    <w:p ns2:paraId="5AC7ECF4" ns2:textId="77777777">
+    <w:p>
       <w:pPr>
         <w:spacing w:line="240" w:lineRule="auto"/>
         <w:contextualSpacing/>
@@ -1015,7 +963,7 @@
         </w:rPr>
       </w:pPr>
     </w:p>
-    <w:p ns2:paraId="42DA39E3" ns2:textId="77777777">
+    <w:p>
       <w:pPr>
         <w:spacing w:line="240" w:lineRule="auto"/>
         <w:contextualSpacing/>
@@ -1026,7 +974,7 @@
         </w:rPr>
       </w:pPr>
     </w:p>
-    <w:p ns2:paraId="48EB8CDC" ns2:textId="77777777">
+    <w:p>
       <w:pPr>
         <w:spacing w:line="240" w:lineRule="auto"/>
         <w:contextualSpacing/>
@@ -1037,7 +985,7 @@
         </w:rPr>
       </w:pPr>
     </w:p>
-    <w:p ns2:paraId="0F87B422" ns2:textId="77777777">
+    <w:p>
       <w:pPr>
         <w:spacing w:line="240" w:lineRule="auto"/>
         <w:contextualSpacing/>
@@ -1048,7 +996,7 @@
         </w:rPr>
       </w:pPr>
     </w:p>
-    <w:p ns2:paraId="64163884" ns2:textId="77777777">
+    <w:p>
       <w:pPr>
         <w:spacing w:line="240" w:lineRule="auto"/>
         <w:contextualSpacing/>
@@ -1059,7 +1007,7 @@
         </w:rPr>
       </w:pPr>
     </w:p>
-    <w:p ns2:paraId="7DC29E46" ns2:textId="34B563AD">
+    <w:p>
       <w:pPr>
         <w:pStyle w:val="NoSpacing"/>
         <w:rPr>
@@ -1122,7 +1070,7 @@
         <w:t>{{TEAM_LEAD}}</w:t>
       </w:r>
     </w:p>
-    <w:p ns2:paraId="17A399A6" ns2:textId="2F26D614">
+    <w:p>
       <w:pPr>
         <w:pStyle w:val="NoSpacing"/>
         <w:rPr>
@@ -1186,7 +1134,7 @@
       </w:r>
     </w:p>
     <w:sectPr>
-      <w:headerReference w:type="default" ns3:id="rId7"/>
+      <w:headerReference w:type="default" r:id="rId7"/>
       <w:pgSz w:w="11907" w:h="16839" w:code="9"/>
       <w:pgMar w:top="1440" w:right="1440" w:bottom="1440" w:left="1440" w:header="720" w:footer="720" w:gutter="0"/>
       <w:cols w:space="720"/>
@@ -1262,18 +1210,8 @@
         <w:b/>
         <w:sz w:val="18"/>
       </w:rPr>
-      <w:t xml:space="preserve">PT. BANK NEGARA INDONESIA (Persero) </w:t>
+      <w:t>PT. BANK NEGARA INDONESIA (Persero) Tbk</w:t>
     </w:r>
-    <w:proofErr w:type="spellStart"/>
-    <w:r>
-      <w:rPr>
-        <w:rFonts w:ascii="Arial" w:hAnsi="Arial" w:cs="Arial"/>
-        <w:b/>
-        <w:sz w:val="18"/>
-      </w:rPr>
-      <w:t>Tbk</w:t>
-    </w:r>
-    <w:proofErr w:type="spellEnd"/>
   </w:p>
   <w:p>
     <w:pPr>

</xml_diff>